<commit_message>
InsyaAllah udh bener semua
</commit_message>
<xml_diff>
--- a/non-website/Laporan Akhir KP/2203040182 - Dhika Ramadhan Saputra - Laporan KP - Revisi 2 (final acc).docx
+++ b/non-website/Laporan Akhir KP/2203040182 - Dhika Ramadhan Saputra - Laporan KP - Revisi 2 (final acc).docx
@@ -3687,40 +3687,17 @@
     </w:p>
     <w:p>
       <w:pPr>
-        <w:tabs>
-          <w:tab w:val="center" w:pos="3970"/>
-        </w:tabs>
-        <w:spacing w:line="480" w:lineRule="auto"/>
-        <w:rPr>
-          <w:rFonts w:ascii="Times New Roman" w:hAnsi="Times New Roman" w:cs="Times New Roman"/>
-        </w:rPr>
-      </w:pPr>
-      <w:r>
-        <w:rPr>
-          <w:rFonts w:ascii="Times New Roman" w:hAnsi="Times New Roman" w:cs="Times New Roman"/>
-        </w:rPr>
+        <w:pStyle w:val="Heading2"/>
+      </w:pPr>
+      <w:r>
         <w:br w:type="page"/>
       </w:r>
       <w:r>
-        <w:rPr>
-          <w:rFonts w:ascii="Times New Roman" w:hAnsi="Times New Roman" w:cs="Times New Roman"/>
-        </w:rPr>
         <w:lastRenderedPageBreak/>
         <w:tab/>
       </w:r>
-    </w:p>
-    <w:p>
-      <w:pPr>
-        <w:pStyle w:val="Heading2"/>
-        <w:rPr>
-          <w:rFonts w:cs="Times New Roman"/>
-        </w:rPr>
-      </w:pPr>
       <w:bookmarkStart w:id="10" w:name="_Toc200619282"/>
       <w:r>
-        <w:rPr>
-          <w:rFonts w:cs="Times New Roman"/>
-        </w:rPr>
         <w:t>DAFTAR GAMBAR</w:t>
       </w:r>
       <w:bookmarkEnd w:id="10"/>
@@ -13032,7 +13009,7 @@
         </w:rPr>
         <w:lastRenderedPageBreak/>
         <w:drawing>
-          <wp:inline distT="0" distB="0" distL="0" distR="0" wp14:anchorId="75188C27" wp14:editId="68F02856">
+          <wp:inline distT="0" distB="0" distL="0" distR="0" wp14:anchorId="75188C27" wp14:editId="49DD1669">
             <wp:extent cx="5004000" cy="1844909"/>
             <wp:effectExtent l="19050" t="19050" r="25400" b="22225"/>
             <wp:docPr id="783286403" name="Picture 4"/>
@@ -13464,7 +13441,7 @@
         </w:rPr>
         <w:lastRenderedPageBreak/>
         <w:drawing>
-          <wp:inline distT="0" distB="0" distL="0" distR="0" wp14:anchorId="02EBA956" wp14:editId="31E9946F">
+          <wp:inline distT="0" distB="0" distL="0" distR="0" wp14:anchorId="02EBA956" wp14:editId="3487693D">
             <wp:extent cx="3888000" cy="2160000"/>
             <wp:effectExtent l="19050" t="19050" r="17780" b="12065"/>
             <wp:docPr id="102117401" name="Picture 5"/>
@@ -19608,7 +19585,7 @@
           <w:noProof/>
         </w:rPr>
         <w:drawing>
-          <wp:inline distT="0" distB="0" distL="0" distR="0" wp14:anchorId="2E33B11D" wp14:editId="3318782A">
+          <wp:inline distT="0" distB="0" distL="0" distR="0" wp14:anchorId="2E33B11D" wp14:editId="3011C38B">
             <wp:extent cx="4475759" cy="4824000"/>
             <wp:effectExtent l="0" t="0" r="1270" b="0"/>
             <wp:docPr id="147966725" name="Picture 9"/>
@@ -37231,6 +37208,7 @@
     <w:rsid w:val="0029117C"/>
     <w:rsid w:val="002A4EB4"/>
     <w:rsid w:val="002E4447"/>
+    <w:rsid w:val="002F138D"/>
     <w:rsid w:val="00307B88"/>
     <w:rsid w:val="00444EA3"/>
     <w:rsid w:val="00462B05"/>
@@ -37243,6 +37221,7 @@
     <w:rsid w:val="00724939"/>
     <w:rsid w:val="00751EDB"/>
     <w:rsid w:val="00763159"/>
+    <w:rsid w:val="007825B2"/>
     <w:rsid w:val="0081424B"/>
     <w:rsid w:val="008F2E33"/>
     <w:rsid w:val="00966163"/>

</xml_diff>